<commit_message>
docs: finalize P08 submission evidence
</commit_message>
<xml_diff>
--- a/P08-60225062-Sani-Validasi-UTS-final.docx
+++ b/P08-60225062-Sani-Validasi-UTS-final.docx
@@ -172,37 +172,7 @@
         <w:pStyle w:val="ListBullet"/>
       </w:pPr>
       <w:r>
-        <w:t xml:space="preserve">Bukti </w:t>
-      </w:r>
-      <w:r>
-        <w:rPr>
-          <w:rFonts w:ascii="Consolas" w:hAnsi="Consolas"/>
-          <w:sz w:val="15"/>
-        </w:rPr>
-        <w:t>git status</w:t>
-      </w:r>
-      <w:r>
-        <w:t xml:space="preserve"> bersih: </w:t>
-      </w:r>
-      <w:r>
-        <w:rPr>
-          <w:rFonts w:ascii="Consolas" w:hAnsi="Consolas"/>
-          <w:sz w:val="15"/>
-        </w:rPr>
-        <w:t>git status --porcelain</w:t>
-      </w:r>
-      <w:r>
-        <w:t xml:space="preserve"> kosong setelah commit pengumpulan P08 </w:t>
-      </w:r>
-      <w:r>
-        <w:rPr>
-          <w:rFonts w:ascii="Consolas" w:hAnsi="Consolas"/>
-          <w:sz w:val="15"/>
-        </w:rPr>
-        <w:t>1f6cefd8afe0201dc216af4e03ac028572ec3224</w:t>
-      </w:r>
-      <w:r>
-        <w:t>. Pembaruan akhir worksheet, screenshot, dan dokumen Word akan disimpan dalam commit final lokal sebelum pengumpulan.</w:t>
+        <w:t>Bukti git status bersih: git status --porcelain kosong setelah seluruh paket final P08 di-commit secara lokal; working tree terverifikasi bersih.</w:t>
       </w:r>
     </w:p>
     <w:p>
@@ -1637,14 +1607,8 @@
             <w:vAlign w:val="center"/>
           </w:tcPr>
           <w:p>
-            <w:pPr>
-              <w:spacing w:after="20"/>
-            </w:pPr>
             <w:r>
-              <w:rPr>
-                <w:sz w:val="13"/>
-              </w:rPr>
-              <w:t>Commit 1f6cefd8afe0201dc216af4e03ac028572ec3224</w:t>
+              <w:t>git status --porcelain kosong setelah commit final lokal</w:t>
             </w:r>
           </w:p>
         </w:tc>
@@ -1654,14 +1618,8 @@
             <w:vAlign w:val="center"/>
           </w:tcPr>
           <w:p>
-            <w:pPr>
-              <w:spacing w:after="20"/>
-            </w:pPr>
             <w:r>
-              <w:rPr>
-                <w:sz w:val="13"/>
-              </w:rPr>
-              <w:t>git status --porcelain kosong setelah commit pengumpulan P08; pembaruan akhir ikut dicatat pada commit lanjutan.</w:t>
+              <w:t>Semua dokumen dan evidence final sudah di-commit; working tree bersih pada verifikasi akhir.</w:t>
             </w:r>
           </w:p>
         </w:tc>
@@ -2228,27 +2186,7 @@
         <w:ind w:left="288"/>
       </w:pPr>
       <w:r>
-        <w:t xml:space="preserve">Pada lebar CSS 320px, Beranda, Tentang, Produk, Galeri, dan Kontak tidak mengalami overflow horizontal. Form tetap di dalam viewport; tabel harga memakai area scroll tersendiri. Baseline pra-JavaScript adalah commit P07 </w:t>
-      </w:r>
-      <w:r>
-        <w:rPr>
-          <w:rFonts w:ascii="Consolas" w:hAnsi="Consolas"/>
-          <w:sz w:val="15"/>
-        </w:rPr>
-        <w:t>43481ca</w:t>
-      </w:r>
-      <w:r>
-        <w:t xml:space="preserve">. Screenshot homepage narrow, homepage wide 1440px, dan form narrow tersedia. Semua bagian pengumpulan telah dilengkapi; bukti </w:t>
-      </w:r>
-      <w:r>
-        <w:rPr>
-          <w:rFonts w:ascii="Consolas" w:hAnsi="Consolas"/>
-          <w:sz w:val="15"/>
-        </w:rPr>
-        <w:t>git status --porcelain</w:t>
-      </w:r>
-      <w:r>
-        <w:t xml:space="preserve"> kosong dicatat setelah commit paket P08 lokal.</w:t>
+        <w:t>Pada lebar CSS 320px, Beranda, Tentang, Produk, Galeri, dan Kontak tidak mengalami overflow horizontal. Form tetap di dalam viewport; tabel harga memakai area scroll tersendiri. Baseline pra-JavaScript adalah commit P07 43481ca. Screenshot homepage narrow dan wide 1440px serta form narrow tersedia. Semua bagian pengumpulan telah dilengkapi. git status --porcelain kosong setelah seluruh paket P08 di-commit secara lokal.</w:t>
       </w:r>
     </w:p>
     <w:p>

</xml_diff>